<commit_message>
Working version with doc editor
</commit_message>
<xml_diff>
--- a/Qubit Lab scripts.docx
+++ b/Qubit Lab scripts.docx
@@ -192,75 +192,54 @@
         <w:t xml:space="preserve"> pretty boring, so Qubit Lab just runs the experiment as fast as it can</w:t>
       </w:r>
       <w:r>
+        <w:t xml:space="preserve"> and the thermometers will keep track of all the outcomes.</w:t>
+      </w:r>
+    </w:p>
+    <w:p>
+      <w:r>
+        <w:t xml:space="preserve">As you can see, </w:t>
+      </w:r>
+      <w:r>
+        <w:t xml:space="preserve">about half the time </w:t>
+      </w:r>
+      <w:r>
+        <w:t>the</w:t>
+      </w:r>
+      <w:r>
+        <w:t xml:space="preserve"> qubit measures red and half the time</w:t>
+      </w:r>
+      <w:r>
+        <w:t xml:space="preserve"> it measures blue</w:t>
+      </w:r>
+      <w:r>
+        <w:t>, just as a fair coin will come heads or tails half the time.</w:t>
+      </w:r>
+    </w:p>
+    <w:p>
+      <w:r>
+        <w:t>So far</w:t>
+      </w:r>
+      <w:r>
+        <w:t xml:space="preserve"> qubits do look a lot like coins don't they?</w:t>
+      </w:r>
+    </w:p>
+    <w:p>
+      <w:r>
+        <w:t xml:space="preserve">One difference has to do with that flipper </w:t>
+      </w:r>
+      <w:r>
+        <w:t>thing</w:t>
+      </w:r>
+      <w:r>
+        <w:t>. You've probably noticed that it has a little clock object on it</w:t>
+      </w:r>
+      <w:r>
+        <w:t>,</w:t>
+      </w:r>
+      <w:r>
         <w:t xml:space="preserve"> </w:t>
       </w:r>
       <w:r>
-        <w:t xml:space="preserve">and the thermometers will </w:t>
-      </w:r>
-      <w:r>
-        <w:t>keep track of</w:t>
-      </w:r>
-      <w:r>
-        <w:t xml:space="preserve"> all the outcomes</w:t>
-      </w:r>
-      <w:r>
-        <w:t>.</w:t>
-      </w:r>
-    </w:p>
-    <w:p>
-      <w:r>
-        <w:t xml:space="preserve">As you can see, </w:t>
-      </w:r>
-      <w:r>
-        <w:t xml:space="preserve">about </w:t>
-      </w:r>
-      <w:r>
-        <w:t>half the time</w:t>
-      </w:r>
-      <w:r>
-        <w:t xml:space="preserve"> </w:t>
-      </w:r>
-      <w:r>
-        <w:t>the</w:t>
-      </w:r>
-      <w:r>
-        <w:t xml:space="preserve"> qubit measures red and half the time</w:t>
-      </w:r>
-      <w:r>
-        <w:t xml:space="preserve"> it measures </w:t>
-      </w:r>
-      <w:r>
-        <w:t>blue</w:t>
-      </w:r>
-      <w:r>
-        <w:t>, just as a fair coin will come heads or tails half the time.</w:t>
-      </w:r>
-    </w:p>
-    <w:p>
-      <w:r>
-        <w:t>So far</w:t>
-      </w:r>
-      <w:r>
-        <w:t xml:space="preserve"> qubits do look a lot like coins don't they?</w:t>
-      </w:r>
-    </w:p>
-    <w:p>
-      <w:r>
-        <w:t xml:space="preserve">One difference has to do with that flipper </w:t>
-      </w:r>
-      <w:r>
-        <w:t>thing</w:t>
-      </w:r>
-      <w:r>
-        <w:t>. You've probably noticed that it has a little clock object on it</w:t>
-      </w:r>
-      <w:r>
-        <w:t>,</w:t>
-      </w:r>
-      <w:r>
-        <w:t xml:space="preserve"> </w:t>
-      </w:r>
-      <w:r>
         <w:t xml:space="preserve">a clock </w:t>
       </w:r>
       <w:r>
@@ -335,6 +314,20 @@
         </w:rPr>
         <w:t xml:space="preserve"> tab brings up this video clip]</w:t>
       </w:r>
+    </w:p>
+    <w:p>
+      <w:pPr>
+        <w:rPr>
+          <w:color w:val="FF0000"/>
+        </w:rPr>
+      </w:pPr>
+    </w:p>
+    <w:p>
+      <w:pPr>
+        <w:rPr>
+          <w:color w:val="FF0000"/>
+        </w:rPr>
+      </w:pPr>
     </w:p>
     <w:p>
       <w:pPr>
@@ -625,6 +618,294 @@
           <w:color w:val="000000" w:themeColor="text1"/>
         </w:rPr>
         <w:t xml:space="preserve">Finally, and this is where it gets interesting, what do you think would happen if you made the control qubit a mixture, say equal parts red and blue? </w:t>
+      </w:r>
+    </w:p>
+    <w:p>
+      <w:pPr>
+        <w:rPr>
+          <w:color w:val="000000" w:themeColor="text1"/>
+        </w:rPr>
+      </w:pPr>
+    </w:p>
+    <w:p>
+      <w:pPr>
+        <w:rPr>
+          <w:color w:val="000000" w:themeColor="text1"/>
+        </w:rPr>
+      </w:pPr>
+    </w:p>
+    <w:p>
+      <w:pPr>
+        <w:rPr>
+          <w:color w:val="FF0000"/>
+        </w:rPr>
+      </w:pPr>
+      <w:r>
+        <w:rPr>
+          <w:color w:val="FF0000"/>
+        </w:rPr>
+        <w:t>Prompt for Codex</w:t>
+      </w:r>
+    </w:p>
+    <w:p>
+      <w:pPr>
+        <w:pStyle w:val="NormalWeb"/>
+      </w:pPr>
+      <w:proofErr w:type="spellStart"/>
+      <w:r>
+        <w:t>i</w:t>
+      </w:r>
+      <w:r>
+        <w:t>Now</w:t>
+      </w:r>
+      <w:proofErr w:type="spellEnd"/>
+      <w:r>
+        <w:t xml:space="preserve"> we're go</w:t>
+      </w:r>
+      <w:r>
+        <w:t>i</w:t>
+      </w:r>
+      <w:r>
+        <w:t xml:space="preserve">ng to build a new doc editor. This editor is entirely </w:t>
+      </w:r>
+      <w:proofErr w:type="spellStart"/>
+      <w:r>
+        <w:t>seoarate</w:t>
+      </w:r>
+      <w:proofErr w:type="spellEnd"/>
+      <w:r>
+        <w:t xml:space="preserve"> from the tab editor that we already have. It create</w:t>
+      </w:r>
+      <w:r>
+        <w:t>s</w:t>
+      </w:r>
+      <w:r>
+        <w:t xml:space="preserve"> documents rather than tabs. Each document will be associated with a tab and will be called up when that tab is run. A document consists of one or more screens, each screen containing one or more components</w:t>
+      </w:r>
+      <w:r>
+        <w:t xml:space="preserve">, either </w:t>
+      </w:r>
+      <w:r>
+        <w:t xml:space="preserve">textboxes, qubits, gates, </w:t>
+      </w:r>
+      <w:r>
+        <w:t>or</w:t>
+      </w:r>
+      <w:r>
+        <w:t xml:space="preserve"> measurement tools. </w:t>
+      </w:r>
+      <w:r>
+        <w:t>Each</w:t>
+      </w:r>
+      <w:r>
+        <w:t xml:space="preserve"> textbox will have one or more buttons and at run time those buttons </w:t>
+      </w:r>
+      <w:r>
+        <w:lastRenderedPageBreak/>
+        <w:t>will be active: the Next button will transition to the next screen, the Done button will return to the running tab, and the Show me button will run the recorded experiment</w:t>
+      </w:r>
+      <w:r>
+        <w:t xml:space="preserve">, if any, </w:t>
+      </w:r>
+      <w:r>
+        <w:t xml:space="preserve">associated with that screen. The editor need not be smart in assigning buttons to </w:t>
+      </w:r>
+      <w:r>
+        <w:t>textboxes</w:t>
+      </w:r>
+      <w:r>
+        <w:t xml:space="preserve">; it can leave that up to the author but </w:t>
+      </w:r>
+      <w:r>
+        <w:t xml:space="preserve">that means that </w:t>
+      </w:r>
+      <w:r>
+        <w:t xml:space="preserve">the author must always have the option of assigning one or more buttons when placing a </w:t>
+      </w:r>
+      <w:r>
+        <w:t>textbox. During editing of a document t</w:t>
+      </w:r>
+      <w:r>
+        <w:t xml:space="preserve">he qubits, gates, and measurement tools are </w:t>
+      </w:r>
+      <w:r>
+        <w:t xml:space="preserve">active, just as they are on a tab; they can be resized or dragged. At run </w:t>
+      </w:r>
+      <w:proofErr w:type="spellStart"/>
+      <w:r>
+        <w:t>tim</w:t>
+      </w:r>
+      <w:proofErr w:type="spellEnd"/>
+      <w:r>
+        <w:t xml:space="preserve"> they are </w:t>
+      </w:r>
+      <w:r>
+        <w:t xml:space="preserve">static graphic objects. However, the doc editor can record an experiment on any screen that has at least one component other than a textbox and at run time the Show me button will </w:t>
+      </w:r>
+      <w:r>
+        <w:t>run</w:t>
+      </w:r>
+      <w:r>
+        <w:t xml:space="preserve"> that experiment</w:t>
+      </w:r>
+      <w:r>
+        <w:t xml:space="preserve"> as a video clip</w:t>
+      </w:r>
+      <w:r>
+        <w:t xml:space="preserve">. </w:t>
+      </w:r>
+      <w:r>
+        <w:t>The</w:t>
+      </w:r>
+      <w:r>
+        <w:t xml:space="preserve"> author will </w:t>
+      </w:r>
+      <w:r>
+        <w:t>start and stop the recording of an experiment by clicking on appropriately labeled buttons and in between performing</w:t>
+      </w:r>
+      <w:r>
+        <w:t xml:space="preserve"> a series of actions such as </w:t>
+      </w:r>
+      <w:r>
+        <w:t>dragging</w:t>
+      </w:r>
+      <w:r>
+        <w:t xml:space="preserve"> a qubit into a gate, altering the state of a </w:t>
+      </w:r>
+      <w:r>
+        <w:t xml:space="preserve">flipper </w:t>
+      </w:r>
+      <w:r>
+        <w:t xml:space="preserve">gate, or dragging a qubit into </w:t>
+      </w:r>
+      <w:r>
+        <w:t xml:space="preserve">the magnifier of </w:t>
+      </w:r>
+      <w:r>
+        <w:t xml:space="preserve">a </w:t>
+      </w:r>
+      <w:r>
+        <w:t>measurement</w:t>
+      </w:r>
+      <w:r>
+        <w:t xml:space="preserve"> tool. </w:t>
+      </w:r>
+      <w:r>
+        <w:t xml:space="preserve">Each experiment so produced will be attached to </w:t>
+      </w:r>
+      <w:r>
+        <w:t xml:space="preserve">that particular screen, to be run as a </w:t>
+      </w:r>
+      <w:r>
+        <w:t>video clip</w:t>
+      </w:r>
+      <w:r>
+        <w:t xml:space="preserve"> when a user clicks on </w:t>
+      </w:r>
+      <w:r>
+        <w:t>the Show me button in a textbox</w:t>
+      </w:r>
+      <w:r>
+        <w:t xml:space="preserve"> on that screen</w:t>
+      </w:r>
+      <w:r>
+        <w:t xml:space="preserve">. </w:t>
+      </w:r>
+      <w:r>
+        <w:t>When using</w:t>
+      </w:r>
+      <w:r>
+        <w:t xml:space="preserve"> the doc editor an author will first point it to an existing tab and then create one or more scenes by populating them with components. When a scene contains an object other than a </w:t>
+      </w:r>
+      <w:r>
+        <w:t>textbox</w:t>
+      </w:r>
+      <w:r>
+        <w:t xml:space="preserve"> the Start </w:t>
+      </w:r>
+      <w:r>
+        <w:t xml:space="preserve">and Stop </w:t>
+      </w:r>
+      <w:r>
+        <w:t>button</w:t>
+      </w:r>
+      <w:r>
+        <w:t>s</w:t>
+      </w:r>
+      <w:r>
+        <w:t xml:space="preserve"> will become active and author will be able to record an experiment. </w:t>
+      </w:r>
+      <w:r>
+        <w:t>Once the experiment has been recorded a Play button will be activated so that the author can review and if necessary write over, the experiment. In</w:t>
+      </w:r>
+      <w:r>
+        <w:t xml:space="preserve"> summary, </w:t>
+      </w:r>
+      <w:r>
+        <w:t>every</w:t>
+      </w:r>
+      <w:r>
+        <w:t xml:space="preserve"> What's this document is associated with a tab and can only be run from that tab. </w:t>
+      </w:r>
+      <w:r>
+        <w:t xml:space="preserve">Tabs can only have one document. </w:t>
+      </w:r>
+      <w:r>
+        <w:t xml:space="preserve">The document consists of a sequence of one or more scenes. A scene consists of one or more components and </w:t>
+      </w:r>
+      <w:r>
+        <w:t xml:space="preserve">can contain </w:t>
+      </w:r>
+      <w:r>
+        <w:t xml:space="preserve">an experiment in the form of a video clip </w:t>
+      </w:r>
+      <w:r>
+        <w:t>that captures</w:t>
+      </w:r>
+      <w:r>
+        <w:t xml:space="preserve"> the motion of qubits, the action of gates and measuring tools, and any changes </w:t>
+      </w:r>
+      <w:r>
+        <w:t xml:space="preserve">made </w:t>
+      </w:r>
+      <w:r>
+        <w:t xml:space="preserve">in the setting of a flipper gate. To facilitate navigation through the scenes, the editor </w:t>
+      </w:r>
+      <w:r>
+        <w:t>must incorporate</w:t>
+      </w:r>
+      <w:r>
+        <w:t xml:space="preserve"> a Back button as well as a Next button and a Done button. There is no need for a Save screen</w:t>
+      </w:r>
+      <w:r>
+        <w:t xml:space="preserve"> button</w:t>
+      </w:r>
+      <w:r>
+        <w:t xml:space="preserve">– the screen can </w:t>
+      </w:r>
+      <w:r>
+        <w:t>automatically</w:t>
+      </w:r>
+      <w:r>
+        <w:t xml:space="preserve"> be saved whenever the author </w:t>
+      </w:r>
+      <w:r>
+        <w:t xml:space="preserve">moves to another screen or </w:t>
+      </w:r>
+      <w:r>
+        <w:t>quits out of the doc edito</w:t>
+      </w:r>
+      <w:r>
+        <w:t>r</w:t>
+      </w:r>
+      <w:r>
+        <w:t xml:space="preserve">. Develop a plan for implementing this feature and let me review it before you </w:t>
+      </w:r>
+      <w:r>
+        <w:t>start</w:t>
+      </w:r>
+      <w:r>
+        <w:t xml:space="preserve"> to code.</w:t>
       </w:r>
     </w:p>
     <w:p>
@@ -1101,6 +1382,22 @@
       <w:szCs w:val="56"/>
     </w:rPr>
   </w:style>
+  <w:style w:type="paragraph" w:styleId="NormalWeb">
+    <w:name w:val="Normal (Web)"/>
+    <w:basedOn w:val="Normal"/>
+    <w:uiPriority w:val="99"/>
+    <w:semiHidden/>
+    <w:unhideWhenUsed/>
+    <w:rsid w:val="004D752F"/>
+    <w:pPr>
+      <w:spacing w:before="100" w:beforeAutospacing="1" w:after="100" w:afterAutospacing="1"/>
+    </w:pPr>
+    <w:rPr>
+      <w:rFonts w:ascii="Times New Roman" w:eastAsia="Times New Roman" w:hAnsi="Times New Roman" w:cs="Times New Roman"/>
+      <w:kern w:val="0"/>
+      <w14:ligatures w14:val="none"/>
+    </w:rPr>
+  </w:style>
 </w:styles>
 </file>
 

</xml_diff>

<commit_message>
Seed Qubit Lab guides and replay fixes
</commit_message>
<xml_diff>
--- a/Qubit Lab scripts.docx
+++ b/Qubit Lab scripts.docx
@@ -12,16 +12,16 @@
     </w:p>
     <w:p>
       <w:r>
-        <w:t>Welcome to Qubit Lab, a place where you can experiment with qubit, flipping them, measuring them and entangling them. You can even teleport the state of a qubit from one computer to another, all with no knowledge of quantum mechanics and no pesky math to deal with</w:t>
+        <w:t>Welcome to Qubit Lab, a place where you can experiment with qubit</w:t>
+      </w:r>
+      <w:r>
+        <w:t>s</w:t>
+      </w:r>
+      <w:r>
+        <w:t>, flipping them, measuring them and entangling them. You can even teleport the state of a qubit from one computer to another, all with no knowledge of quantum mechanics and no pesky math to deal with</w:t>
       </w:r>
       <w:r>
         <w:t>!</w:t>
-      </w:r>
-      <w:r>
-        <w:t xml:space="preserve"> </w:t>
-      </w:r>
-      <w:r>
-        <w:t>]</w:t>
       </w:r>
     </w:p>
     <w:p>
@@ -674,165 +674,60 @@
       </w:r>
       <w:proofErr w:type="spellEnd"/>
       <w:r>
-        <w:t xml:space="preserve"> from the tab editor that we already have. It create</w:t>
+        <w:t xml:space="preserve"> from the tab editor that we already have. It creates documents rather than tabs. Each document will be associated with a tab and will be called up when that tab is run. A document consists of one or more screens, each screen containing one or more components, either textboxes, qubits, gates, or measurement tools. Each textbox will have one or more buttons and at run time those buttons </w:t>
+      </w:r>
+      <w:r>
+        <w:lastRenderedPageBreak/>
+        <w:t xml:space="preserve">will be active: the Next button will transition to the next screen, the Done button will return to the running tab, and the Show me button will run the recorded experiment, if any, associated with that screen. The editor need not be smart in assigning buttons to textboxes; it can leave that up to the author but that means that the author must always have the option of assigning one or more buttons when placing a textbox. During editing of a document the qubits, gates, and measurement tools are active, just as they are on a tab; they can be resized or dragged. At run </w:t>
+      </w:r>
+      <w:proofErr w:type="spellStart"/>
+      <w:r>
+        <w:t>tim</w:t>
+      </w:r>
+      <w:proofErr w:type="spellEnd"/>
+      <w:r>
+        <w:t xml:space="preserve"> they are static graphic objects. However, the doc editor can record an experiment on any screen that has at least one component other than a textbox and at run time the Show me button will run that experiment as a video clip. The author will start and stop the recording of an experiment by clicking on appropriately labeled buttons and in between performing a series of actions such as dragging a qubit into a gate, altering the state of a flipper gate, or dragging a qubit into the magnifier of a measurement tool. Each experiment so produced will be attached to </w:t>
+      </w:r>
+      <w:r>
+        <w:t xml:space="preserve">that particular screen, to be run as a </w:t>
+      </w:r>
+      <w:r>
+        <w:t>video clip</w:t>
+      </w:r>
+      <w:r>
+        <w:t xml:space="preserve"> when a user clicks on </w:t>
+      </w:r>
+      <w:r>
+        <w:t>the Show me button in a textbox</w:t>
+      </w:r>
+      <w:r>
+        <w:t xml:space="preserve"> on that screen</w:t>
+      </w:r>
+      <w:r>
+        <w:t xml:space="preserve">. </w:t>
+      </w:r>
+      <w:r>
+        <w:t>When using</w:t>
+      </w:r>
+      <w:r>
+        <w:t xml:space="preserve"> the doc editor an author will first point it to an existing tab and then create one or more scenes by populating them with components. When a scene contains an object other than a </w:t>
+      </w:r>
+      <w:r>
+        <w:t>textbox</w:t>
+      </w:r>
+      <w:r>
+        <w:t xml:space="preserve"> the Start </w:t>
+      </w:r>
+      <w:r>
+        <w:t xml:space="preserve">and Stop </w:t>
+      </w:r>
+      <w:r>
+        <w:t>button</w:t>
       </w:r>
       <w:r>
         <w:t>s</w:t>
       </w:r>
       <w:r>
-        <w:t xml:space="preserve"> documents rather than tabs. Each document will be associated with a tab and will be called up when that tab is run. A document consists of one or more screens, each screen containing one or more components</w:t>
-      </w:r>
-      <w:r>
-        <w:t xml:space="preserve">, either </w:t>
-      </w:r>
-      <w:r>
-        <w:t xml:space="preserve">textboxes, qubits, gates, </w:t>
-      </w:r>
-      <w:r>
-        <w:t>or</w:t>
-      </w:r>
-      <w:r>
-        <w:t xml:space="preserve"> measurement tools. </w:t>
-      </w:r>
-      <w:r>
-        <w:t>Each</w:t>
-      </w:r>
-      <w:r>
-        <w:t xml:space="preserve"> textbox will have one or more buttons and at run time those buttons </w:t>
-      </w:r>
-      <w:r>
-        <w:lastRenderedPageBreak/>
-        <w:t>will be active: the Next button will transition to the next screen, the Done button will return to the running tab, and the Show me button will run the recorded experiment</w:t>
-      </w:r>
-      <w:r>
-        <w:t xml:space="preserve">, if any, </w:t>
-      </w:r>
-      <w:r>
-        <w:t xml:space="preserve">associated with that screen. The editor need not be smart in assigning buttons to </w:t>
-      </w:r>
-      <w:r>
-        <w:t>textboxes</w:t>
-      </w:r>
-      <w:r>
-        <w:t xml:space="preserve">; it can leave that up to the author but </w:t>
-      </w:r>
-      <w:r>
-        <w:t xml:space="preserve">that means that </w:t>
-      </w:r>
-      <w:r>
-        <w:t xml:space="preserve">the author must always have the option of assigning one or more buttons when placing a </w:t>
-      </w:r>
-      <w:r>
-        <w:t>textbox. During editing of a document t</w:t>
-      </w:r>
-      <w:r>
-        <w:t xml:space="preserve">he qubits, gates, and measurement tools are </w:t>
-      </w:r>
-      <w:r>
-        <w:t xml:space="preserve">active, just as they are on a tab; they can be resized or dragged. At run </w:t>
-      </w:r>
-      <w:proofErr w:type="spellStart"/>
-      <w:r>
-        <w:t>tim</w:t>
-      </w:r>
-      <w:proofErr w:type="spellEnd"/>
-      <w:r>
-        <w:t xml:space="preserve"> they are </w:t>
-      </w:r>
-      <w:r>
-        <w:t xml:space="preserve">static graphic objects. However, the doc editor can record an experiment on any screen that has at least one component other than a textbox and at run time the Show me button will </w:t>
-      </w:r>
-      <w:r>
-        <w:t>run</w:t>
-      </w:r>
-      <w:r>
-        <w:t xml:space="preserve"> that experiment</w:t>
-      </w:r>
-      <w:r>
-        <w:t xml:space="preserve"> as a video clip</w:t>
-      </w:r>
-      <w:r>
-        <w:t xml:space="preserve">. </w:t>
-      </w:r>
-      <w:r>
-        <w:t>The</w:t>
-      </w:r>
-      <w:r>
-        <w:t xml:space="preserve"> author will </w:t>
-      </w:r>
-      <w:r>
-        <w:t>start and stop the recording of an experiment by clicking on appropriately labeled buttons and in between performing</w:t>
-      </w:r>
-      <w:r>
-        <w:t xml:space="preserve"> a series of actions such as </w:t>
-      </w:r>
-      <w:r>
-        <w:t>dragging</w:t>
-      </w:r>
-      <w:r>
-        <w:t xml:space="preserve"> a qubit into a gate, altering the state of a </w:t>
-      </w:r>
-      <w:r>
-        <w:t xml:space="preserve">flipper </w:t>
-      </w:r>
-      <w:r>
-        <w:t xml:space="preserve">gate, or dragging a qubit into </w:t>
-      </w:r>
-      <w:r>
-        <w:t xml:space="preserve">the magnifier of </w:t>
-      </w:r>
-      <w:r>
-        <w:t xml:space="preserve">a </w:t>
-      </w:r>
-      <w:r>
-        <w:t>measurement</w:t>
-      </w:r>
-      <w:r>
-        <w:t xml:space="preserve"> tool. </w:t>
-      </w:r>
-      <w:r>
-        <w:t xml:space="preserve">Each experiment so produced will be attached to </w:t>
-      </w:r>
-      <w:r>
-        <w:t xml:space="preserve">that particular screen, to be run as a </w:t>
-      </w:r>
-      <w:r>
-        <w:t>video clip</w:t>
-      </w:r>
-      <w:r>
-        <w:t xml:space="preserve"> when a user clicks on </w:t>
-      </w:r>
-      <w:r>
-        <w:t>the Show me button in a textbox</w:t>
-      </w:r>
-      <w:r>
-        <w:t xml:space="preserve"> on that screen</w:t>
-      </w:r>
-      <w:r>
-        <w:t xml:space="preserve">. </w:t>
-      </w:r>
-      <w:r>
-        <w:t>When using</w:t>
-      </w:r>
-      <w:r>
-        <w:t xml:space="preserve"> the doc editor an author will first point it to an existing tab and then create one or more scenes by populating them with components. When a scene contains an object other than a </w:t>
-      </w:r>
-      <w:r>
-        <w:t>textbox</w:t>
-      </w:r>
-      <w:r>
-        <w:t xml:space="preserve"> the Start </w:t>
-      </w:r>
-      <w:r>
-        <w:t xml:space="preserve">and Stop </w:t>
-      </w:r>
-      <w:r>
-        <w:t>button</w:t>
-      </w:r>
-      <w:r>
-        <w:t>s</w:t>
-      </w:r>
-      <w:r>
         <w:t xml:space="preserve"> will become active and author will be able to record an experiment. </w:t>
       </w:r>
       <w:r>
@@ -881,13 +776,7 @@
         <w:t xml:space="preserve"> button</w:t>
       </w:r>
       <w:r>
-        <w:t xml:space="preserve">– the screen can </w:t>
-      </w:r>
-      <w:r>
-        <w:t>automatically</w:t>
-      </w:r>
-      <w:r>
-        <w:t xml:space="preserve"> be saved whenever the author </w:t>
+        <w:t xml:space="preserve">– the screen can automatically be saved whenever the author </w:t>
       </w:r>
       <w:r>
         <w:t xml:space="preserve">moves to another screen or </w:t>
@@ -899,13 +788,7 @@
         <w:t>r</w:t>
       </w:r>
       <w:r>
-        <w:t xml:space="preserve">. Develop a plan for implementing this feature and let me review it before you </w:t>
-      </w:r>
-      <w:r>
-        <w:t>start</w:t>
-      </w:r>
-      <w:r>
-        <w:t xml:space="preserve"> to code.</w:t>
+        <w:t>. Develop a plan for implementing this feature and let me review it before you start to code.</w:t>
       </w:r>
     </w:p>
     <w:p>

</xml_diff>